<commit_message>
Simulated stages 1, 2, & 3.
</commit_message>
<xml_diff>
--- a/EG6801_Week4_Lab_PID_MPC.docx
+++ b/EG6801_Week4_Lab_PID_MPC.docx
@@ -187,15 +187,7 @@
         <w:pStyle w:val="Ttulo1"/>
       </w:pPr>
       <w:r>
-        <w:t xml:space="preserve">4. Lab </w:t>
-      </w:r>
-      <w:proofErr w:type="gramStart"/>
-      <w:r>
-        <w:t>at a glance</w:t>
-      </w:r>
-      <w:proofErr w:type="gramEnd"/>
-      <w:r>
-        <w:t xml:space="preserve"> </w:t>
+        <w:t xml:space="preserve">4. Lab at a glance </w:t>
       </w:r>
     </w:p>
     <w:tbl>
@@ -362,15 +354,7 @@
           </w:tcPr>
           <w:p>
             <w:r>
-              <w:t xml:space="preserve">PID and MPC </w:t>
-            </w:r>
-            <w:proofErr w:type="gramStart"/>
-            <w:r>
-              <w:t>runs</w:t>
-            </w:r>
-            <w:proofErr w:type="gramEnd"/>
-            <w:r>
-              <w:t xml:space="preserve"> under S3</w:t>
+              <w:t>PID and MPC runs under S3</w:t>
             </w:r>
           </w:p>
         </w:tc>
@@ -1802,39 +1786,7 @@
           <w:i/>
           <w:sz w:val="20"/>
         </w:rPr>
-        <w:t xml:space="preserve">Important: </w:t>
-      </w:r>
-      <w:proofErr w:type="gramStart"/>
-      <w:r>
-        <w:rPr>
-          <w:i/>
-          <w:sz w:val="20"/>
-        </w:rPr>
-        <w:t>timestamp</w:t>
-      </w:r>
-      <w:proofErr w:type="gramEnd"/>
-      <w:r>
-        <w:rPr>
-          <w:i/>
-          <w:sz w:val="20"/>
-        </w:rPr>
-        <w:t xml:space="preserve"> tasks around </w:t>
-      </w:r>
-      <w:proofErr w:type="gramStart"/>
-      <w:r>
-        <w:rPr>
-          <w:i/>
-          <w:sz w:val="20"/>
-        </w:rPr>
-        <w:t>the real</w:t>
-      </w:r>
-      <w:proofErr w:type="gramEnd"/>
-      <w:r>
-        <w:rPr>
-          <w:i/>
-          <w:sz w:val="20"/>
-        </w:rPr>
-        <w:t xml:space="preserve"> work. Do not place start and end timestamps in the wrong place or your timing data will look perfect but be false.</w:t>
+        <w:t>Important: timestamp tasks around the real work. Do not place start and end timestamps in the wrong place or your timing data will look perfect but be false.</w:t>
       </w:r>
     </w:p>
     <w:p>
@@ -2145,15 +2097,7 @@
           </w:tcPr>
           <w:p>
             <w:r>
-              <w:t xml:space="preserve">Generalization and </w:t>
-            </w:r>
-            <w:proofErr w:type="gramStart"/>
-            <w:r>
-              <w:t>controller</w:t>
-            </w:r>
-            <w:proofErr w:type="gramEnd"/>
-            <w:r>
-              <w:t xml:space="preserve"> robustness</w:t>
+              <w:t>Generalization and controller robustness</w:t>
             </w:r>
           </w:p>
         </w:tc>
@@ -2248,7 +2192,7 @@
           </w:tcPr>
           <w:p>
             <w:r>
-              <w:t xml:space="preserve">20 to 50 </w:t>
+              <w:t xml:space="preserve">20 </w:t>
             </w:r>
             <w:proofErr w:type="spellStart"/>
             <w:r>
@@ -2296,7 +2240,7 @@
           </w:tcPr>
           <w:p>
             <w:r>
-              <w:t>15 to 30 s</w:t>
+              <w:t>30 s</w:t>
             </w:r>
           </w:p>
         </w:tc>
@@ -2331,7 +2275,16 @@
           </w:tcPr>
           <w:p>
             <w:r>
-              <w:t>0 to 1.0 step at t=2s</w:t>
+              <w:t xml:space="preserve">22 </w:t>
+            </w:r>
+            <w:r>
+              <w:t>step at t=</w:t>
+            </w:r>
+            <w:r>
+              <w:t>0</w:t>
+            </w:r>
+            <w:r>
+              <w:t>s</w:t>
             </w:r>
           </w:p>
         </w:tc>
@@ -2366,7 +2319,19 @@
           </w:tcPr>
           <w:p>
             <w:r>
-              <w:t>Enable T5 CPU loop or file burst</w:t>
+              <w:t>Enable T5 CPU lo</w:t>
+            </w:r>
+            <w:r>
+              <w:t>op (</w:t>
+            </w:r>
+            <w:r>
+              <w:t xml:space="preserve">injected </w:t>
+            </w:r>
+            <w:r>
+              <w:t>6ms load to CPU</w:t>
+            </w:r>
+            <w:r>
+              <w:t>)</w:t>
             </w:r>
           </w:p>
         </w:tc>
@@ -2401,7 +2366,22 @@
           </w:tcPr>
           <w:p>
             <w:r>
-              <w:t>Pulse disturbance at t=8s</w:t>
+              <w:t>0.8 step</w:t>
+            </w:r>
+            <w:r>
+              <w:t xml:space="preserve"> disturbance</w:t>
+            </w:r>
+            <w:r>
+              <w:t xml:space="preserve"> to control output</w:t>
+            </w:r>
+            <w:r>
+              <w:t xml:space="preserve"> at t=</w:t>
+            </w:r>
+            <w:r>
+              <w:t>10</w:t>
+            </w:r>
+            <w:r>
+              <w:t>s</w:t>
             </w:r>
           </w:p>
         </w:tc>
@@ -2426,6 +2406,33 @@
           </w:tcPr>
           <w:p>
             <w:r>
+              <w:t>S4 Noise</w:t>
+            </w:r>
+          </w:p>
+        </w:tc>
+        <w:tc>
+          <w:tcPr>
+            <w:tcW w:w="3600" w:type="dxa"/>
+          </w:tcPr>
+          <w:p/>
+        </w:tc>
+        <w:tc>
+          <w:tcPr>
+            <w:tcW w:w="3600" w:type="dxa"/>
+          </w:tcPr>
+          <w:p/>
+        </w:tc>
+      </w:tr>
+      <w:tr>
+        <w:trPr>
+          <w:jc w:val="center"/>
+        </w:trPr>
+        <w:tc>
+          <w:tcPr>
+            <w:tcW w:w="2448" w:type="dxa"/>
+          </w:tcPr>
+          <w:p>
+            <w:r>
               <w:t>Actuator limit</w:t>
             </w:r>
           </w:p>
@@ -2478,14 +2485,9 @@
         <w:pStyle w:val="Listaconvietas"/>
       </w:pPr>
       <w:r>
-        <w:t xml:space="preserve">Overshoot (%) </w:t>
-      </w:r>
-      <w:proofErr w:type="gramStart"/>
-      <w:r>
-        <w:t>= ((</w:t>
+        <w:t>Overshoot (%) = ((</w:t>
       </w:r>
       <w:proofErr w:type="spellStart"/>
-      <w:proofErr w:type="gramEnd"/>
       <w:r>
         <w:t>y_peak</w:t>
       </w:r>
@@ -2523,21 +2525,8 @@
       </w:r>
       <w:proofErr w:type="spellEnd"/>
       <w:r>
-        <w:t xml:space="preserve"> - </w:t>
-      </w:r>
-      <w:proofErr w:type="gramStart"/>
-      <w:r>
-        <w:t>mean(</w:t>
-      </w:r>
-      <w:proofErr w:type="gramEnd"/>
-      <w:r>
-        <w:t xml:space="preserve">y in final </w:t>
-      </w:r>
-      <w:proofErr w:type="gramStart"/>
-      <w:r>
-        <w:t>window)|</w:t>
-      </w:r>
-      <w:proofErr w:type="gramEnd"/>
+        <w:t xml:space="preserve"> - mean(y in final window)|</w:t>
+      </w:r>
     </w:p>
     <w:p>
       <w:pPr>
@@ -2588,35 +2577,11 @@
       </w:r>
       <w:proofErr w:type="spellEnd"/>
       <w:r>
-        <w:t xml:space="preserve"> = </w:t>
-      </w:r>
-      <w:proofErr w:type="gramStart"/>
-      <w:r>
-        <w:t>12  -</w:t>
-      </w:r>
-      <w:proofErr w:type="gramEnd"/>
-      <w:r>
-        <w:t xml:space="preserve">&gt; Overshoot </w:t>
-      </w:r>
-      <w:proofErr w:type="gramStart"/>
-      <w:r>
-        <w:t>= ((</w:t>
-      </w:r>
-      <w:proofErr w:type="gramEnd"/>
-      <w:r>
-        <w:t>12 - 10) / 10) * 100 = 20%</w:t>
+        <w:t xml:space="preserve"> = 12  -&gt; Overshoot = ((12 - 10) / 10) * 100 = 20%</w:t>
       </w:r>
       <w:r>
         <w:br/>
-        <w:t xml:space="preserve">  In the last 2 seconds, mean(y) = </w:t>
-      </w:r>
-      <w:proofErr w:type="gramStart"/>
-      <w:r>
-        <w:t>9.7  -</w:t>
-      </w:r>
-      <w:proofErr w:type="gramEnd"/>
-      <w:r>
-        <w:t>&gt; SSE = |10 - 9.7| = 0.3</w:t>
+        <w:t xml:space="preserve">  In the last 2 seconds, mean(y) = 9.7  -&gt; SSE = |10 - 9.7| = 0.3</w:t>
       </w:r>
       <w:r>
         <w:br/>
@@ -2682,6 +2647,7 @@
         <w:pStyle w:val="Listaconvietas"/>
       </w:pPr>
       <w:r>
+        <w:lastRenderedPageBreak/>
         <w:t>Miss rate = (number of late cycles / total cycles) * 100</w:t>
       </w:r>
     </w:p>
@@ -2706,7 +2672,6 @@
         <w:pStyle w:val="Listaconvietas"/>
       </w:pPr>
       <w:r>
-        <w:lastRenderedPageBreak/>
         <w:t xml:space="preserve">Task bottleneck = task with highest mean or max </w:t>
       </w:r>
       <w:proofErr w:type="spellStart"/>
@@ -2798,15 +2763,7 @@
         <w:pStyle w:val="Listaconnmeros"/>
       </w:pPr>
       <w:r>
-        <w:t xml:space="preserve">Write a config.txt file template for each run </w:t>
-      </w:r>
-      <w:proofErr w:type="gramStart"/>
-      <w:r>
-        <w:t>with:</w:t>
-      </w:r>
-      <w:proofErr w:type="gramEnd"/>
-      <w:r>
-        <w:t xml:space="preserve"> controller mode, </w:t>
+        <w:t xml:space="preserve">Write a config.txt file template for each run with: controller mode, </w:t>
       </w:r>
       <w:proofErr w:type="spellStart"/>
       <w:r>
@@ -2830,15 +2787,7 @@
         <w:pStyle w:val="Listaconnmeros"/>
       </w:pPr>
       <w:r>
-        <w:t xml:space="preserve">Choose deadlines. For this week, set cycle deadline </w:t>
-      </w:r>
-      <w:proofErr w:type="gramStart"/>
-      <w:r>
-        <w:t>equal</w:t>
-      </w:r>
-      <w:proofErr w:type="gramEnd"/>
-      <w:r>
-        <w:t xml:space="preserve"> to </w:t>
+        <w:t xml:space="preserve">Choose deadlines. For this week, set cycle deadline equal to </w:t>
       </w:r>
       <w:proofErr w:type="spellStart"/>
       <w:r>
@@ -2997,15 +2946,7 @@
         <w:pStyle w:val="Listaconnmeros"/>
       </w:pPr>
       <w:r>
-        <w:t xml:space="preserve">Log control signals </w:t>
-      </w:r>
-      <w:proofErr w:type="gramStart"/>
-      <w:r>
-        <w:t>r,</w:t>
-      </w:r>
-      <w:proofErr w:type="gramEnd"/>
-      <w:r>
-        <w:t xml:space="preserve"> y, e, and u every cycle. Compute e = r - y in code to avoid mistakes.</w:t>
+        <w:t>Log control signals r, y, e, and u every cycle. Compute e = r - y in code to avoid mistakes.</w:t>
       </w:r>
     </w:p>
     <w:p>
@@ -3119,6 +3060,7 @@
         <w:pStyle w:val="Listaconnmeros"/>
       </w:pPr>
       <w:r>
+        <w:lastRenderedPageBreak/>
         <w:t>PID S1 Step nominal: Step setpoint (for example 0 to 1 at t=2 s), stress OFF. Run for 15 to 30 s and save cycle.csv and tasks.csv.</w:t>
       </w:r>
     </w:p>
@@ -3127,16 +3069,7 @@
         <w:pStyle w:val="Listaconnmeros"/>
       </w:pPr>
       <w:r>
-        <w:lastRenderedPageBreak/>
-        <w:t xml:space="preserve">PID S2 Step with stress: Repeat S1 </w:t>
-      </w:r>
-      <w:proofErr w:type="gramStart"/>
-      <w:r>
-        <w:t>exactly, but</w:t>
-      </w:r>
-      <w:proofErr w:type="gramEnd"/>
-      <w:r>
-        <w:t xml:space="preserve"> turn T5 stress ON. Use the same step, same dt, same gains, and same run length.</w:t>
+        <w:t>PID S2 Step with stress: Repeat S1 exactly, but turn T5 stress ON. Use the same step, same dt, same gains, and same run length.</w:t>
       </w:r>
     </w:p>
     <w:p>
@@ -3144,15 +3077,7 @@
         <w:pStyle w:val="Listaconnmeros"/>
       </w:pPr>
       <w:r>
-        <w:t xml:space="preserve">PID S3 Disturbance or saturation: Choose one and document it in config.txt. Example A: inject a disturbance pulse at t=8 s. Example B: enforce actuator saturation so </w:t>
-      </w:r>
-      <w:proofErr w:type="gramStart"/>
-      <w:r>
-        <w:t>u hits</w:t>
-      </w:r>
-      <w:proofErr w:type="gramEnd"/>
-      <w:r>
-        <w:t xml:space="preserve"> a limit during the step.</w:t>
+        <w:t>PID S3 Disturbance or saturation: Choose one and document it in config.txt. Example A: inject a disturbance pulse at t=8 s. Example B: enforce actuator saturation so u hits a limit during the step.</w:t>
       </w:r>
     </w:p>
     <w:p>
@@ -3212,23 +3137,7 @@
         <w:ind w:left="216"/>
       </w:pPr>
       <w:r>
-        <w:t xml:space="preserve">If </w:t>
-      </w:r>
-      <w:proofErr w:type="gramStart"/>
-      <w:r>
-        <w:t>u saturates</w:t>
-      </w:r>
-      <w:proofErr w:type="gramEnd"/>
-      <w:r>
-        <w:t xml:space="preserve">, what happened to </w:t>
-      </w:r>
-      <w:proofErr w:type="gramStart"/>
-      <w:r>
-        <w:t>e over</w:t>
-      </w:r>
-      <w:proofErr w:type="gramEnd"/>
-      <w:r>
-        <w:t xml:space="preserve"> time and why?</w:t>
+        <w:t>If u saturates, what happened to e over time and why?</w:t>
       </w:r>
     </w:p>
     <w:p>
@@ -3476,6 +3385,7 @@
         <w:rPr>
           <w:b/>
         </w:rPr>
+        <w:lastRenderedPageBreak/>
         <w:t>Sanity-check questions</w:t>
       </w:r>
     </w:p>
@@ -3485,7 +3395,6 @@
         <w:ind w:left="216"/>
       </w:pPr>
       <w:r>
-        <w:lastRenderedPageBreak/>
         <w:t>Did you find any data issue? If yes, what was it and how did you fix it?</w:t>
       </w:r>
     </w:p>
@@ -3600,15 +3509,7 @@
         <w:ind w:left="216"/>
       </w:pPr>
       <w:r>
-        <w:t xml:space="preserve">What is the main trade-off you observed (for example better control but slower </w:t>
-      </w:r>
-      <w:proofErr w:type="gramStart"/>
-      <w:r>
-        <w:t>compute</w:t>
-      </w:r>
-      <w:proofErr w:type="gramEnd"/>
-      <w:r>
-        <w:t>)?</w:t>
+        <w:t>What is the main trade-off you observed (for example better control but slower compute)?</w:t>
       </w:r>
     </w:p>
     <w:p>
@@ -3641,65 +3542,40 @@
       <w:pPr>
         <w:pStyle w:val="Listaconvietas"/>
       </w:pPr>
-      <w:proofErr w:type="gramStart"/>
-      <w:r>
-        <w:t>[ ]</w:t>
-      </w:r>
-      <w:proofErr w:type="gramEnd"/>
-      <w:r>
-        <w:t xml:space="preserve"> Each required run folder contains config.txt, cycle.csv, and tasks.csv</w:t>
+      <w:r>
+        <w:t>[ ] Each required run folder contains config.txt, cycle.csv, and tasks.csv</w:t>
       </w:r>
     </w:p>
     <w:p>
       <w:pPr>
         <w:pStyle w:val="Listaconvietas"/>
       </w:pPr>
-      <w:proofErr w:type="gramStart"/>
-      <w:r>
-        <w:t>[ ]</w:t>
-      </w:r>
-      <w:proofErr w:type="gramEnd"/>
-      <w:r>
-        <w:t xml:space="preserve"> At least one y vs r plot for PID and one for MPC</w:t>
+      <w:r>
+        <w:t>[ ] At least one y vs r plot for PID and one for MPC</w:t>
       </w:r>
     </w:p>
     <w:p>
       <w:pPr>
         <w:pStyle w:val="Listaconvietas"/>
       </w:pPr>
-      <w:proofErr w:type="gramStart"/>
-      <w:r>
-        <w:t>[ ]</w:t>
-      </w:r>
-      <w:proofErr w:type="gramEnd"/>
-      <w:r>
-        <w:t xml:space="preserve"> At least one latency plot for PID and one for MPC</w:t>
+      <w:r>
+        <w:t>[ ] At least one latency plot for PID and one for MPC</w:t>
       </w:r>
     </w:p>
     <w:p>
       <w:pPr>
         <w:pStyle w:val="Listaconvietas"/>
       </w:pPr>
-      <w:proofErr w:type="gramStart"/>
-      <w:r>
-        <w:t>[ ]</w:t>
-      </w:r>
-      <w:proofErr w:type="gramEnd"/>
-      <w:r>
-        <w:t xml:space="preserve"> Summary table completed</w:t>
+      <w:r>
+        <w:t>[ ] Summary table completed</w:t>
       </w:r>
     </w:p>
     <w:p>
       <w:pPr>
         <w:pStyle w:val="Listaconvietas"/>
       </w:pPr>
-      <w:proofErr w:type="gramStart"/>
-      <w:r>
-        <w:t>[ ]</w:t>
-      </w:r>
-      <w:proofErr w:type="gramEnd"/>
-      <w:r>
-        <w:t xml:space="preserve"> Guided questions answered in your notes or report</w:t>
+      <w:r>
+        <w:t>[ ] Guided questions answered in your notes or report</w:t>
       </w:r>
     </w:p>
     <w:p>
@@ -4412,27 +4288,20 @@
               <w:rPr>
                 <w:b/>
               </w:rPr>
-              <w:t>No missing values</w:t>
-            </w:r>
-          </w:p>
-        </w:tc>
-        <w:tc>
-          <w:tcPr>
-            <w:tcW w:w="1440" w:type="dxa"/>
-            <w:shd w:val="clear" w:color="auto" w:fill="D9E1F2"/>
-          </w:tcPr>
-          <w:p>
+              <w:t xml:space="preserve">No missing </w:t>
+            </w:r>
             <w:r>
               <w:rPr>
                 <w:b/>
               </w:rPr>
-              <w:t>Time monotonic</w:t>
-            </w:r>
-          </w:p>
-        </w:tc>
-        <w:tc>
-          <w:tcPr>
-            <w:tcW w:w="1728" w:type="dxa"/>
+              <w:lastRenderedPageBreak/>
+              <w:t>values</w:t>
+            </w:r>
+          </w:p>
+        </w:tc>
+        <w:tc>
+          <w:tcPr>
+            <w:tcW w:w="1440" w:type="dxa"/>
             <w:shd w:val="clear" w:color="auto" w:fill="D9E1F2"/>
           </w:tcPr>
           <w:p>
@@ -4440,27 +4309,21 @@
               <w:rPr>
                 <w:b/>
               </w:rPr>
-              <w:t>e = r - y checked</w:t>
-            </w:r>
-          </w:p>
-        </w:tc>
-        <w:tc>
-          <w:tcPr>
-            <w:tcW w:w="1728" w:type="dxa"/>
-            <w:shd w:val="clear" w:color="auto" w:fill="D9E1F2"/>
-          </w:tcPr>
-          <w:p>
+              <w:lastRenderedPageBreak/>
+              <w:t xml:space="preserve">Time </w:t>
+            </w:r>
             <w:r>
               <w:rPr>
                 <w:b/>
               </w:rPr>
-              <w:t>No impossible values</w:t>
-            </w:r>
-          </w:p>
-        </w:tc>
-        <w:tc>
-          <w:tcPr>
-            <w:tcW w:w="2880" w:type="dxa"/>
+              <w:lastRenderedPageBreak/>
+              <w:t>monotonic</w:t>
+            </w:r>
+          </w:p>
+        </w:tc>
+        <w:tc>
+          <w:tcPr>
+            <w:tcW w:w="1728" w:type="dxa"/>
             <w:shd w:val="clear" w:color="auto" w:fill="D9E1F2"/>
           </w:tcPr>
           <w:p>
@@ -4468,6 +4331,51 @@
               <w:rPr>
                 <w:b/>
               </w:rPr>
+              <w:lastRenderedPageBreak/>
+              <w:t xml:space="preserve">e = r - y </w:t>
+            </w:r>
+            <w:r>
+              <w:rPr>
+                <w:b/>
+              </w:rPr>
+              <w:lastRenderedPageBreak/>
+              <w:t>checked</w:t>
+            </w:r>
+          </w:p>
+        </w:tc>
+        <w:tc>
+          <w:tcPr>
+            <w:tcW w:w="1728" w:type="dxa"/>
+            <w:shd w:val="clear" w:color="auto" w:fill="D9E1F2"/>
+          </w:tcPr>
+          <w:p>
+            <w:r>
+              <w:rPr>
+                <w:b/>
+              </w:rPr>
+              <w:lastRenderedPageBreak/>
+              <w:t xml:space="preserve">No impossible </w:t>
+            </w:r>
+            <w:r>
+              <w:rPr>
+                <w:b/>
+              </w:rPr>
+              <w:lastRenderedPageBreak/>
+              <w:t>values</w:t>
+            </w:r>
+          </w:p>
+        </w:tc>
+        <w:tc>
+          <w:tcPr>
+            <w:tcW w:w="2880" w:type="dxa"/>
+            <w:shd w:val="clear" w:color="auto" w:fill="D9E1F2"/>
+          </w:tcPr>
+          <w:p>
+            <w:r>
+              <w:rPr>
+                <w:b/>
+              </w:rPr>
+              <w:lastRenderedPageBreak/>
               <w:t>Comments</w:t>
             </w:r>
           </w:p>
@@ -4528,7 +4436,6 @@
           </w:tcPr>
           <w:p>
             <w:r>
-              <w:lastRenderedPageBreak/>
               <w:t>PID_S2</w:t>
             </w:r>
           </w:p>
@@ -4772,15 +4679,7 @@
         <w:ind w:left="216"/>
       </w:pPr>
       <w:r>
-        <w:t xml:space="preserve">What data </w:t>
-      </w:r>
-      <w:proofErr w:type="gramStart"/>
-      <w:r>
-        <w:t>was</w:t>
-      </w:r>
-      <w:proofErr w:type="gramEnd"/>
-      <w:r>
-        <w:t xml:space="preserve"> essential for control interpretation?</w:t>
+        <w:t>What data was essential for control interpretation?</w:t>
       </w:r>
     </w:p>
     <w:p>
@@ -5033,15 +4932,7 @@
           </w:tcPr>
           <w:p>
             <w:r>
-              <w:t xml:space="preserve">MPC </w:t>
-            </w:r>
-            <w:proofErr w:type="gramStart"/>
-            <w:r>
-              <w:t>misses</w:t>
-            </w:r>
-            <w:proofErr w:type="gramEnd"/>
-            <w:r>
-              <w:t xml:space="preserve"> deadlines</w:t>
+              <w:t>MPC misses deadlines</w:t>
             </w:r>
           </w:p>
         </w:tc>

</xml_diff>

<commit_message>
Stage 4 data log.
</commit_message>
<xml_diff>
--- a/EG6801_Week4_Lab_PID_MPC.docx
+++ b/EG6801_Week4_Lab_PID_MPC.docx
@@ -187,7 +187,15 @@
         <w:pStyle w:val="Ttulo1"/>
       </w:pPr>
       <w:r>
-        <w:t xml:space="preserve">4. Lab at a glance </w:t>
+        <w:t xml:space="preserve">4. Lab </w:t>
+      </w:r>
+      <w:proofErr w:type="gramStart"/>
+      <w:r>
+        <w:t>at a glance</w:t>
+      </w:r>
+      <w:proofErr w:type="gramEnd"/>
+      <w:r>
+        <w:t xml:space="preserve"> </w:t>
       </w:r>
     </w:p>
     <w:tbl>
@@ -354,7 +362,15 @@
           </w:tcPr>
           <w:p>
             <w:r>
-              <w:t>PID and MPC runs under S3</w:t>
+              <w:t xml:space="preserve">PID and MPC </w:t>
+            </w:r>
+            <w:proofErr w:type="gramStart"/>
+            <w:r>
+              <w:t>runs</w:t>
+            </w:r>
+            <w:proofErr w:type="gramEnd"/>
+            <w:r>
+              <w:t xml:space="preserve"> under S3</w:t>
             </w:r>
           </w:p>
         </w:tc>
@@ -1786,7 +1802,39 @@
           <w:i/>
           <w:sz w:val="20"/>
         </w:rPr>
-        <w:t>Important: timestamp tasks around the real work. Do not place start and end timestamps in the wrong place or your timing data will look perfect but be false.</w:t>
+        <w:t xml:space="preserve">Important: </w:t>
+      </w:r>
+      <w:proofErr w:type="gramStart"/>
+      <w:r>
+        <w:rPr>
+          <w:i/>
+          <w:sz w:val="20"/>
+        </w:rPr>
+        <w:t>timestamp</w:t>
+      </w:r>
+      <w:proofErr w:type="gramEnd"/>
+      <w:r>
+        <w:rPr>
+          <w:i/>
+          <w:sz w:val="20"/>
+        </w:rPr>
+        <w:t xml:space="preserve"> tasks around </w:t>
+      </w:r>
+      <w:proofErr w:type="gramStart"/>
+      <w:r>
+        <w:rPr>
+          <w:i/>
+          <w:sz w:val="20"/>
+        </w:rPr>
+        <w:t>the real</w:t>
+      </w:r>
+      <w:proofErr w:type="gramEnd"/>
+      <w:r>
+        <w:rPr>
+          <w:i/>
+          <w:sz w:val="20"/>
+        </w:rPr>
+        <w:t xml:space="preserve"> work. Do not place start and end timestamps in the wrong place or your timing data will look perfect but be false.</w:t>
       </w:r>
     </w:p>
     <w:p>
@@ -2097,7 +2145,15 @@
           </w:tcPr>
           <w:p>
             <w:r>
-              <w:t>Generalization and controller robustness</w:t>
+              <w:t xml:space="preserve">Generalization and </w:t>
+            </w:r>
+            <w:proofErr w:type="gramStart"/>
+            <w:r>
+              <w:t>controller</w:t>
+            </w:r>
+            <w:proofErr w:type="gramEnd"/>
+            <w:r>
+              <w:t xml:space="preserve"> robustness</w:t>
             </w:r>
           </w:p>
         </w:tc>
@@ -2277,8 +2333,13 @@
             <w:r>
               <w:t xml:space="preserve">22 </w:t>
             </w:r>
-            <w:r>
-              <w:t>step at t=</w:t>
+            <w:proofErr w:type="gramStart"/>
+            <w:r>
+              <w:t>step</w:t>
+            </w:r>
+            <w:proofErr w:type="gramEnd"/>
+            <w:r>
+              <w:t xml:space="preserve"> at t=</w:t>
             </w:r>
             <w:r>
               <w:t>0</w:t>
@@ -2414,7 +2475,11 @@
           <w:tcPr>
             <w:tcW w:w="3600" w:type="dxa"/>
           </w:tcPr>
-          <w:p/>
+          <w:p>
+            <w:r>
+              <w:t>Randomized noise (-0.5 - 0.5) added to measurements before being passed to the Pi.</w:t>
+            </w:r>
+          </w:p>
         </w:tc>
         <w:tc>
           <w:tcPr>
@@ -2443,7 +2508,7 @@
           </w:tcPr>
           <w:p>
             <w:r>
-              <w:t>u in [0, 1] or plant-safe limit</w:t>
+              <w:t>u in [0, 1]</w:t>
             </w:r>
           </w:p>
         </w:tc>
@@ -2485,9 +2550,14 @@
         <w:pStyle w:val="Listaconvietas"/>
       </w:pPr>
       <w:r>
-        <w:t>Overshoot (%) = ((</w:t>
+        <w:t xml:space="preserve">Overshoot (%) </w:t>
+      </w:r>
+      <w:proofErr w:type="gramStart"/>
+      <w:r>
+        <w:t>= ((</w:t>
       </w:r>
       <w:proofErr w:type="spellStart"/>
+      <w:proofErr w:type="gramEnd"/>
       <w:r>
         <w:t>y_peak</w:t>
       </w:r>
@@ -2525,8 +2595,21 @@
       </w:r>
       <w:proofErr w:type="spellEnd"/>
       <w:r>
-        <w:t xml:space="preserve"> - mean(y in final window)|</w:t>
-      </w:r>
+        <w:t xml:space="preserve"> - </w:t>
+      </w:r>
+      <w:proofErr w:type="gramStart"/>
+      <w:r>
+        <w:t>mean(</w:t>
+      </w:r>
+      <w:proofErr w:type="gramEnd"/>
+      <w:r>
+        <w:t xml:space="preserve">y in final </w:t>
+      </w:r>
+      <w:proofErr w:type="gramStart"/>
+      <w:r>
+        <w:t>window)|</w:t>
+      </w:r>
+      <w:proofErr w:type="gramEnd"/>
     </w:p>
     <w:p>
       <w:pPr>
@@ -2577,11 +2660,35 @@
       </w:r>
       <w:proofErr w:type="spellEnd"/>
       <w:r>
-        <w:t xml:space="preserve"> = 12  -&gt; Overshoot = ((12 - 10) / 10) * 100 = 20%</w:t>
+        <w:t xml:space="preserve"> = </w:t>
+      </w:r>
+      <w:proofErr w:type="gramStart"/>
+      <w:r>
+        <w:t>12  -</w:t>
+      </w:r>
+      <w:proofErr w:type="gramEnd"/>
+      <w:r>
+        <w:t xml:space="preserve">&gt; Overshoot </w:t>
+      </w:r>
+      <w:proofErr w:type="gramStart"/>
+      <w:r>
+        <w:t>= ((</w:t>
+      </w:r>
+      <w:proofErr w:type="gramEnd"/>
+      <w:r>
+        <w:t>12 - 10) / 10) * 100 = 20%</w:t>
       </w:r>
       <w:r>
         <w:br/>
-        <w:t xml:space="preserve">  In the last 2 seconds, mean(y) = 9.7  -&gt; SSE = |10 - 9.7| = 0.3</w:t>
+        <w:t xml:space="preserve">  In the last 2 seconds, mean(y) = </w:t>
+      </w:r>
+      <w:proofErr w:type="gramStart"/>
+      <w:r>
+        <w:t>9.7  -</w:t>
+      </w:r>
+      <w:proofErr w:type="gramEnd"/>
+      <w:r>
+        <w:t>&gt; SSE = |10 - 9.7| = 0.3</w:t>
       </w:r>
       <w:r>
         <w:br/>
@@ -2592,6 +2699,7 @@
         <w:pStyle w:val="Ttulo2"/>
       </w:pPr>
       <w:r>
+        <w:lastRenderedPageBreak/>
         <w:t>10.2 Timing metrics</w:t>
       </w:r>
     </w:p>
@@ -2647,7 +2755,6 @@
         <w:pStyle w:val="Listaconvietas"/>
       </w:pPr>
       <w:r>
-        <w:lastRenderedPageBreak/>
         <w:t>Miss rate = (number of late cycles / total cycles) * 100</w:t>
       </w:r>
     </w:p>
@@ -2763,7 +2870,15 @@
         <w:pStyle w:val="Listaconnmeros"/>
       </w:pPr>
       <w:r>
-        <w:t xml:space="preserve">Write a config.txt file template for each run with: controller mode, </w:t>
+        <w:t xml:space="preserve">Write a config.txt file template for each run </w:t>
+      </w:r>
+      <w:proofErr w:type="gramStart"/>
+      <w:r>
+        <w:t>with:</w:t>
+      </w:r>
+      <w:proofErr w:type="gramEnd"/>
+      <w:r>
+        <w:t xml:space="preserve"> controller mode, </w:t>
       </w:r>
       <w:proofErr w:type="spellStart"/>
       <w:r>
@@ -2787,7 +2902,15 @@
         <w:pStyle w:val="Listaconnmeros"/>
       </w:pPr>
       <w:r>
-        <w:t xml:space="preserve">Choose deadlines. For this week, set cycle deadline equal to </w:t>
+        <w:t xml:space="preserve">Choose deadlines. For this week, set cycle deadline </w:t>
+      </w:r>
+      <w:proofErr w:type="gramStart"/>
+      <w:r>
+        <w:t>equal</w:t>
+      </w:r>
+      <w:proofErr w:type="gramEnd"/>
+      <w:r>
+        <w:t xml:space="preserve"> to </w:t>
       </w:r>
       <w:proofErr w:type="spellStart"/>
       <w:r>
@@ -2946,7 +3069,15 @@
         <w:pStyle w:val="Listaconnmeros"/>
       </w:pPr>
       <w:r>
-        <w:t>Log control signals r, y, e, and u every cycle. Compute e = r - y in code to avoid mistakes.</w:t>
+        <w:t xml:space="preserve">Log control signals </w:t>
+      </w:r>
+      <w:proofErr w:type="gramStart"/>
+      <w:r>
+        <w:t>r,</w:t>
+      </w:r>
+      <w:proofErr w:type="gramEnd"/>
+      <w:r>
+        <w:t xml:space="preserve"> y, e, and u every cycle. Compute e = r - y in code to avoid mistakes.</w:t>
       </w:r>
     </w:p>
     <w:p>
@@ -3047,6 +3178,7 @@
         <w:pStyle w:val="Ttulo2"/>
       </w:pPr>
       <w:r>
+        <w:lastRenderedPageBreak/>
         <w:t>11.3 Part C - PID experiments</w:t>
       </w:r>
     </w:p>
@@ -3060,7 +3192,6 @@
         <w:pStyle w:val="Listaconnmeros"/>
       </w:pPr>
       <w:r>
-        <w:lastRenderedPageBreak/>
         <w:t>PID S1 Step nominal: Step setpoint (for example 0 to 1 at t=2 s), stress OFF. Run for 15 to 30 s and save cycle.csv and tasks.csv.</w:t>
       </w:r>
     </w:p>
@@ -3069,7 +3200,15 @@
         <w:pStyle w:val="Listaconnmeros"/>
       </w:pPr>
       <w:r>
-        <w:t>PID S2 Step with stress: Repeat S1 exactly, but turn T5 stress ON. Use the same step, same dt, same gains, and same run length.</w:t>
+        <w:t xml:space="preserve">PID S2 Step with stress: Repeat S1 </w:t>
+      </w:r>
+      <w:proofErr w:type="gramStart"/>
+      <w:r>
+        <w:t>exactly, but</w:t>
+      </w:r>
+      <w:proofErr w:type="gramEnd"/>
+      <w:r>
+        <w:t xml:space="preserve"> turn T5 stress ON. Use the same step, same dt, same gains, and same run length.</w:t>
       </w:r>
     </w:p>
     <w:p>
@@ -3077,7 +3216,15 @@
         <w:pStyle w:val="Listaconnmeros"/>
       </w:pPr>
       <w:r>
-        <w:t>PID S3 Disturbance or saturation: Choose one and document it in config.txt. Example A: inject a disturbance pulse at t=8 s. Example B: enforce actuator saturation so u hits a limit during the step.</w:t>
+        <w:t xml:space="preserve">PID S3 Disturbance or saturation: Choose one and document it in config.txt. Example A: inject a disturbance pulse at t=8 s. Example B: enforce actuator saturation so </w:t>
+      </w:r>
+      <w:proofErr w:type="gramStart"/>
+      <w:r>
+        <w:t>u hits</w:t>
+      </w:r>
+      <w:proofErr w:type="gramEnd"/>
+      <w:r>
+        <w:t xml:space="preserve"> a limit during the step.</w:t>
       </w:r>
     </w:p>
     <w:p>
@@ -3137,7 +3284,23 @@
         <w:ind w:left="216"/>
       </w:pPr>
       <w:r>
-        <w:t>If u saturates, what happened to e over time and why?</w:t>
+        <w:t xml:space="preserve">If </w:t>
+      </w:r>
+      <w:proofErr w:type="gramStart"/>
+      <w:r>
+        <w:t>u saturates</w:t>
+      </w:r>
+      <w:proofErr w:type="gramEnd"/>
+      <w:r>
+        <w:t xml:space="preserve">, what happened to </w:t>
+      </w:r>
+      <w:proofErr w:type="gramStart"/>
+      <w:r>
+        <w:t>e over</w:t>
+      </w:r>
+      <w:proofErr w:type="gramEnd"/>
+      <w:r>
+        <w:t xml:space="preserve"> time and why?</w:t>
       </w:r>
     </w:p>
     <w:p>
@@ -3369,6 +3532,7 @@
         <w:pStyle w:val="Listaconnmeros"/>
       </w:pPr>
       <w:r>
+        <w:lastRenderedPageBreak/>
         <w:t>Check sequence numbers (if used). Note any gaps and explain them (packet drop, restart, logging issue, etc.).</w:t>
       </w:r>
     </w:p>
@@ -3385,7 +3549,6 @@
         <w:rPr>
           <w:b/>
         </w:rPr>
-        <w:lastRenderedPageBreak/>
         <w:t>Sanity-check questions</w:t>
       </w:r>
     </w:p>
@@ -3509,7 +3672,15 @@
         <w:ind w:left="216"/>
       </w:pPr>
       <w:r>
-        <w:t>What is the main trade-off you observed (for example better control but slower compute)?</w:t>
+        <w:t xml:space="preserve">What is the main trade-off you observed (for example better control but slower </w:t>
+      </w:r>
+      <w:proofErr w:type="gramStart"/>
+      <w:r>
+        <w:t>compute</w:t>
+      </w:r>
+      <w:proofErr w:type="gramEnd"/>
+      <w:r>
+        <w:t>)?</w:t>
       </w:r>
     </w:p>
     <w:p>
@@ -3542,40 +3713,65 @@
       <w:pPr>
         <w:pStyle w:val="Listaconvietas"/>
       </w:pPr>
-      <w:r>
-        <w:t>[ ] Each required run folder contains config.txt, cycle.csv, and tasks.csv</w:t>
+      <w:proofErr w:type="gramStart"/>
+      <w:r>
+        <w:t>[ ]</w:t>
+      </w:r>
+      <w:proofErr w:type="gramEnd"/>
+      <w:r>
+        <w:t xml:space="preserve"> Each required run folder contains config.txt, cycle.csv, and tasks.csv</w:t>
       </w:r>
     </w:p>
     <w:p>
       <w:pPr>
         <w:pStyle w:val="Listaconvietas"/>
       </w:pPr>
-      <w:r>
-        <w:t>[ ] At least one y vs r plot for PID and one for MPC</w:t>
+      <w:proofErr w:type="gramStart"/>
+      <w:r>
+        <w:t>[ ]</w:t>
+      </w:r>
+      <w:proofErr w:type="gramEnd"/>
+      <w:r>
+        <w:t xml:space="preserve"> At least one y vs r plot for PID and one for MPC</w:t>
       </w:r>
     </w:p>
     <w:p>
       <w:pPr>
         <w:pStyle w:val="Listaconvietas"/>
       </w:pPr>
-      <w:r>
-        <w:t>[ ] At least one latency plot for PID and one for MPC</w:t>
+      <w:proofErr w:type="gramStart"/>
+      <w:r>
+        <w:t>[ ]</w:t>
+      </w:r>
+      <w:proofErr w:type="gramEnd"/>
+      <w:r>
+        <w:t xml:space="preserve"> At least one latency plot for PID and one for MPC</w:t>
       </w:r>
     </w:p>
     <w:p>
       <w:pPr>
         <w:pStyle w:val="Listaconvietas"/>
       </w:pPr>
-      <w:r>
-        <w:t>[ ] Summary table completed</w:t>
+      <w:proofErr w:type="gramStart"/>
+      <w:r>
+        <w:t>[ ]</w:t>
+      </w:r>
+      <w:proofErr w:type="gramEnd"/>
+      <w:r>
+        <w:t xml:space="preserve"> Summary table completed</w:t>
       </w:r>
     </w:p>
     <w:p>
       <w:pPr>
         <w:pStyle w:val="Listaconvietas"/>
       </w:pPr>
-      <w:r>
-        <w:t>[ ] Guided questions answered in your notes or report</w:t>
+      <w:proofErr w:type="gramStart"/>
+      <w:r>
+        <w:t>[ ]</w:t>
+      </w:r>
+      <w:proofErr w:type="gramEnd"/>
+      <w:r>
+        <w:t xml:space="preserve"> Guided questions answered in your notes or report</w:t>
       </w:r>
     </w:p>
     <w:p>
@@ -4169,6 +4365,7 @@
           </w:tcPr>
           <w:p>
             <w:r>
+              <w:lastRenderedPageBreak/>
               <w:t>MPC_S3</w:t>
             </w:r>
           </w:p>
@@ -4288,20 +4485,27 @@
               <w:rPr>
                 <w:b/>
               </w:rPr>
-              <w:t xml:space="preserve">No missing </w:t>
-            </w:r>
+              <w:t>No missing values</w:t>
+            </w:r>
+          </w:p>
+        </w:tc>
+        <w:tc>
+          <w:tcPr>
+            <w:tcW w:w="1440" w:type="dxa"/>
+            <w:shd w:val="clear" w:color="auto" w:fill="D9E1F2"/>
+          </w:tcPr>
+          <w:p>
             <w:r>
               <w:rPr>
                 <w:b/>
               </w:rPr>
-              <w:lastRenderedPageBreak/>
-              <w:t>values</w:t>
-            </w:r>
-          </w:p>
-        </w:tc>
-        <w:tc>
-          <w:tcPr>
-            <w:tcW w:w="1440" w:type="dxa"/>
+              <w:t>Time monotonic</w:t>
+            </w:r>
+          </w:p>
+        </w:tc>
+        <w:tc>
+          <w:tcPr>
+            <w:tcW w:w="1728" w:type="dxa"/>
             <w:shd w:val="clear" w:color="auto" w:fill="D9E1F2"/>
           </w:tcPr>
           <w:p>
@@ -4309,21 +4513,27 @@
               <w:rPr>
                 <w:b/>
               </w:rPr>
-              <w:lastRenderedPageBreak/>
-              <w:t xml:space="preserve">Time </w:t>
-            </w:r>
+              <w:t>e = r - y checked</w:t>
+            </w:r>
+          </w:p>
+        </w:tc>
+        <w:tc>
+          <w:tcPr>
+            <w:tcW w:w="1728" w:type="dxa"/>
+            <w:shd w:val="clear" w:color="auto" w:fill="D9E1F2"/>
+          </w:tcPr>
+          <w:p>
             <w:r>
               <w:rPr>
                 <w:b/>
               </w:rPr>
-              <w:lastRenderedPageBreak/>
-              <w:t>monotonic</w:t>
-            </w:r>
-          </w:p>
-        </w:tc>
-        <w:tc>
-          <w:tcPr>
-            <w:tcW w:w="1728" w:type="dxa"/>
+              <w:t>No impossible values</w:t>
+            </w:r>
+          </w:p>
+        </w:tc>
+        <w:tc>
+          <w:tcPr>
+            <w:tcW w:w="2880" w:type="dxa"/>
             <w:shd w:val="clear" w:color="auto" w:fill="D9E1F2"/>
           </w:tcPr>
           <w:p>
@@ -4331,51 +4541,6 @@
               <w:rPr>
                 <w:b/>
               </w:rPr>
-              <w:lastRenderedPageBreak/>
-              <w:t xml:space="preserve">e = r - y </w:t>
-            </w:r>
-            <w:r>
-              <w:rPr>
-                <w:b/>
-              </w:rPr>
-              <w:lastRenderedPageBreak/>
-              <w:t>checked</w:t>
-            </w:r>
-          </w:p>
-        </w:tc>
-        <w:tc>
-          <w:tcPr>
-            <w:tcW w:w="1728" w:type="dxa"/>
-            <w:shd w:val="clear" w:color="auto" w:fill="D9E1F2"/>
-          </w:tcPr>
-          <w:p>
-            <w:r>
-              <w:rPr>
-                <w:b/>
-              </w:rPr>
-              <w:lastRenderedPageBreak/>
-              <w:t xml:space="preserve">No impossible </w:t>
-            </w:r>
-            <w:r>
-              <w:rPr>
-                <w:b/>
-              </w:rPr>
-              <w:lastRenderedPageBreak/>
-              <w:t>values</w:t>
-            </w:r>
-          </w:p>
-        </w:tc>
-        <w:tc>
-          <w:tcPr>
-            <w:tcW w:w="2880" w:type="dxa"/>
-            <w:shd w:val="clear" w:color="auto" w:fill="D9E1F2"/>
-          </w:tcPr>
-          <w:p>
-            <w:r>
-              <w:rPr>
-                <w:b/>
-              </w:rPr>
-              <w:lastRenderedPageBreak/>
               <w:t>Comments</w:t>
             </w:r>
           </w:p>
@@ -4679,7 +4844,15 @@
         <w:ind w:left="216"/>
       </w:pPr>
       <w:r>
-        <w:t>What data was essential for control interpretation?</w:t>
+        <w:t xml:space="preserve">What data </w:t>
+      </w:r>
+      <w:proofErr w:type="gramStart"/>
+      <w:r>
+        <w:t>was</w:t>
+      </w:r>
+      <w:proofErr w:type="gramEnd"/>
+      <w:r>
+        <w:t xml:space="preserve"> essential for control interpretation?</w:t>
       </w:r>
     </w:p>
     <w:p>
@@ -4932,7 +5105,15 @@
           </w:tcPr>
           <w:p>
             <w:r>
-              <w:t>MPC misses deadlines</w:t>
+              <w:t xml:space="preserve">MPC </w:t>
+            </w:r>
+            <w:proofErr w:type="gramStart"/>
+            <w:r>
+              <w:t>misses</w:t>
+            </w:r>
+            <w:proofErr w:type="gramEnd"/>
+            <w:r>
+              <w:t xml:space="preserve"> deadlines</w:t>
             </w:r>
           </w:p>
         </w:tc>

</xml_diff>